<commit_message>
test: add a Course ID to the e2e filled-in storyboard fixture
The importer now requires Course ID, so the fixture's Confirm button
stayed disabled and the end-to-end import test failed in CI.

Co-Authored-By: Claude Sonnet 5.5 <noreply@anthropic.com>
</commit_message>
<xml_diff>
--- a/tests/fixtures/storyboard/e2e-valid-filled.docx
+++ b/tests/fixtures/storyboard/e2e-valid-filled.docx
@@ -31,6 +31,22 @@
           <w:p>
             <w:r>
               <w:t xml:space="preserve">Warehouse Safety Basics</w:t>
+            </w:r>
+          </w:p>
+        </w:tc>
+      </w:tr>
+      <w:tr>
+        <w:tc>
+          <w:p>
+            <w:r>
+              <w:t xml:space="preserve">Course ID</w:t>
+            </w:r>
+          </w:p>
+        </w:tc>
+        <w:tc>
+          <w:p>
+            <w:r>
+              <w:t xml:space="preserve">WH-SAFETY-101</w:t>
             </w:r>
           </w:p>
         </w:tc>

</xml_diff>